<commit_message>
Site updated: 2024-03-29 11:45:17
</commit_message>
<xml_diff>
--- a/treasure/download/杂藏-139部/史传部-96部/新建文件夹/大唐西域求法高僧传-唐-义净.docx
+++ b/treasure/download/杂藏-139部/史传部-96部/新建文件夹/大唐西域求法高僧传-唐-义净.docx
@@ -17382,19 +17382,8 @@
           <w:szCs w:val="24"/>
           <w:shd w:val="pct15" w:color="auto" w:fill="FFFFFF"/>
         </w:rPr>
-        <w:t>想，念竹苑以翘心。泛舶行至</w:t>
-      </w:r>
-      <w:bookmarkStart w:id="0" w:name="_GoBack"/>
-      <w:r>
-        <w:rPr>
-          <w:rFonts w:ascii="楷体" w:eastAsia="楷体" w:hAnsi="楷体" w:hint="eastAsia"/>
-          <w:sz w:val="24"/>
-          <w:szCs w:val="24"/>
-          <w:shd w:val="pct15" w:color="auto" w:fill="FFFFFF"/>
-        </w:rPr>
-        <w:t>占波</w:t>
-      </w:r>
-      <w:bookmarkEnd w:id="0"/>
+        <w:t>想，念竹苑以翘心。泛舶行至占波</w:t>
+      </w:r>
       <w:r>
         <w:rPr>
           <w:rFonts w:ascii="楷体" w:eastAsia="楷体" w:hAnsi="楷体" w:hint="eastAsia"/>
@@ -24442,6 +24431,7 @@
     <w:p>
       <w:pPr>
         <w:ind w:firstLine="480"/>
+        <w:jc w:val="center"/>
         <w:rPr>
           <w:rFonts w:ascii="楷体" w:eastAsia="楷体" w:hAnsi="楷体"/>
           <w:sz w:val="24"/>
@@ -24489,6 +24479,7 @@
     <w:p>
       <w:pPr>
         <w:ind w:firstLine="480"/>
+        <w:jc w:val="center"/>
         <w:rPr>
           <w:rFonts w:ascii="楷体" w:eastAsia="楷体" w:hAnsi="楷体"/>
           <w:sz w:val="24"/>
@@ -24536,6 +24527,7 @@
     <w:p>
       <w:pPr>
         <w:ind w:firstLine="480"/>
+        <w:jc w:val="center"/>
         <w:rPr>
           <w:rFonts w:ascii="楷体" w:eastAsia="楷体" w:hAnsi="楷体"/>
           <w:sz w:val="24"/>
@@ -24570,10 +24562,13 @@
         </w:rPr>
         <w:t>龙河激水流。</w:t>
       </w:r>
+      <w:bookmarkStart w:id="0" w:name="_GoBack"/>
+      <w:bookmarkEnd w:id="0"/>
     </w:p>
     <w:p>
       <w:pPr>
         <w:ind w:firstLine="480"/>
+        <w:jc w:val="center"/>
         <w:rPr>
           <w:rFonts w:ascii="楷体" w:eastAsia="楷体" w:hAnsi="楷体"/>
           <w:sz w:val="24"/>
@@ -24612,6 +24607,7 @@
     <w:p>
       <w:pPr>
         <w:ind w:firstLine="480"/>
+        <w:jc w:val="center"/>
         <w:rPr>
           <w:rFonts w:ascii="楷体" w:eastAsia="楷体" w:hAnsi="楷体"/>
           <w:sz w:val="24"/>

</xml_diff>